<commit_message>
Stopped-follower tier-2 batch: both-stationary queue seeds are attentive-unreachable
The 20 low-speed seeds ran under the new desired-speed convention and
produced a finding, not a fix: the lead also stands still in these
scenarios, whose original crashes came from the generator's
abnormal-acceleration mode (56% of both-stationary cases per W25a). The
closed-loop driver correctly stays put; the crashes are reachable only
through the abnormal-acceleration and no-response components, as tier 1
treats them. Arbiter refreshed to n=24 (one creeping seed joined);
verdict unchanged: zero start closer on 20/24, median |diff| 0.55 s.

Co-Authored-By: Claude Fable 5 <noreply@anthropic.com>
</commit_message>
<xml_diff>
--- a/docs/crash_causation_results.docx
+++ b/docs/crash_causation_results.docx
@@ -1067,13 +1067,13 @@
         <w:t xml:space="preserve"> </w:t>
       </w:r>
       <w:r>
-        <w:t xml:space="preserve">the closed-loop model's own onsets match the zero-start surrogate to a median 0.30 s</w:t>
-      </w:r>
-      <w:r>
-        <w:t xml:space="preserve"> </w:t>
-      </w:r>
-      <w:r>
-        <w:t xml:space="preserve">across 23 seeds and reject the stationary start on 19 of 23. The 0.023 figure stands;</w:t>
+        <w:t xml:space="preserve">the closed-loop model's own onsets match the zero-start surrogate to a median 0.42 s</w:t>
+      </w:r>
+      <w:r>
+        <w:t xml:space="preserve"> </w:t>
+      </w:r>
+      <w:r>
+        <w:t xml:space="preserve">across 24 seeds and reject the stationary start on 20 of 24. The 0.023 figure stands;</w:t>
       </w:r>
       <w:r>
         <w:t xml:space="preserve"> </w:t>
@@ -2668,7 +2668,7 @@
               <w:pStyle w:val="Compact"/>
             </w:pPr>
             <w:r>
-              <w:t xml:space="preserve">comparison (attentive onsets, n = 23 seeds)</w:t>
+              <w:t xml:space="preserve">comparison (attentive onsets, n = 24 seeds)</w:t>
             </w:r>
           </w:p>
         </w:tc>
@@ -2725,7 +2725,7 @@
               <w:pStyle w:val="Compact"/>
             </w:pPr>
             <w:r>
-              <w:t xml:space="preserve">+0.30 s</w:t>
+              <w:t xml:space="preserve">+0.42 s</w:t>
             </w:r>
           </w:p>
         </w:tc>
@@ -2751,7 +2751,7 @@
                 <w:b/>
                 <w:bCs/>
               </w:rPr>
-              <w:t xml:space="preserve">19/23 seeds</w:t>
+              <w:t xml:space="preserve">20/24 seeds</w:t>
             </w:r>
           </w:p>
         </w:tc>
@@ -2775,29 +2775,29 @@
               <w:pStyle w:val="Compact"/>
             </w:pPr>
             <w:r>
-              <w:t xml:space="preserve">+1.00 s</w:t>
-            </w:r>
-          </w:p>
-        </w:tc>
-        <w:tc>
-          <w:tcPr/>
-          <w:p>
-            <w:pPr>
-              <w:pStyle w:val="Compact"/>
-            </w:pPr>
-            <w:r>
-              <w:t xml:space="preserve">1.05 s</w:t>
-            </w:r>
-          </w:p>
-        </w:tc>
-        <w:tc>
-          <w:tcPr/>
-          <w:p>
-            <w:pPr>
-              <w:pStyle w:val="Compact"/>
-            </w:pPr>
-            <w:r>
-              <w:t xml:space="preserve">4/23 seeds</w:t>
+              <w:t xml:space="preserve">+1.03 s</w:t>
+            </w:r>
+          </w:p>
+        </w:tc>
+        <w:tc>
+          <w:tcPr/>
+          <w:p>
+            <w:pPr>
+              <w:pStyle w:val="Compact"/>
+            </w:pPr>
+            <w:r>
+              <w:t xml:space="preserve">1.08 s</w:t>
+            </w:r>
+          </w:p>
+        </w:tc>
+        <w:tc>
+          <w:tcPr/>
+          <w:p>
+            <w:pPr>
+              <w:pStyle w:val="Compact"/>
+            </w:pPr>
+            <w:r>
+              <w:t xml:space="preserve">4/24 seeds</w:t>
             </w:r>
           </w:p>
         </w:tc>
@@ -3565,7 +3565,7 @@
         <w:t xml:space="preserve"> </w:t>
       </w:r>
       <w:r>
-        <w:t xml:space="preserve">closed loop matches the zero-start surrogate (median difference +0.30 s, 19/23 seeds</w:t>
+        <w:t xml:space="preserve">closed loop matches the zero-start surrogate (median difference +0.42 s, 20/24 seeds</w:t>
       </w:r>
       <w:r>
         <w:t xml:space="preserve"> </w:t>
@@ -3725,19 +3725,77 @@
         </w:numPr>
       </w:pPr>
       <w:r>
-        <w:t xml:space="preserve">The stopped/creeping-follower seeds (20 of the 100-seed sample) run under the</w:t>
-      </w:r>
-      <w:r>
-        <w:t xml:space="preserve"> </w:t>
-      </w:r>
-      <w:r>
-        <w:t xml:space="preserve">desired-speed convention decided 2026-08-25 (the speed the original follower later</w:t>
-      </w:r>
-      <w:r>
-        <w:t xml:space="preserve"> </w:t>
-      </w:r>
-      <w:r>
-        <w:t xml:space="preserve">reached); their tier-2 batch was launched with this revision.</w:t>
+        <w:t xml:space="preserve">The stopped/creeping-follower seeds (20 of the 100-seed sample) have now run in</w:t>
+      </w:r>
+      <w:r>
+        <w:t xml:space="preserve"> </w:t>
+      </w:r>
+      <w:r>
+        <w:t xml:space="preserve">tier 2 under the desired-speed convention of 2026-08-25 (the speed the original</w:t>
+      </w:r>
+      <w:r>
+        <w:t xml:space="preserve"> </w:t>
+      </w:r>
+      <w:r>
+        <w:t xml:space="preserve">follower later reached), and the result is a finding rather than a fix: these are</w:t>
+      </w:r>
+      <w:r>
+        <w:t xml:space="preserve"> </w:t>
+      </w:r>
+      <w:r>
+        <w:rPr>
+          <w:b/>
+          <w:bCs/>
+        </w:rPr>
+        <w:t xml:space="preserve">both-stationary queue scenarios</w:t>
+      </w:r>
+      <w:r>
+        <w:t xml:space="preserve"> </w:t>
+      </w:r>
+      <w:r>
+        <w:t xml:space="preserve">— the lead also stands still — whose original</w:t>
+      </w:r>
+      <w:r>
+        <w:t xml:space="preserve"> </w:t>
+      </w:r>
+      <w:r>
+        <w:t xml:space="preserve">crashes came from the generator's abnormal-acceleration mode driving into the queue</w:t>
+      </w:r>
+      <w:r>
+        <w:t xml:space="preserve"> </w:t>
+      </w:r>
+      <w:r>
+        <w:t xml:space="preserve">(56% of both-stationary cases in [W25a]'s own statistics). The closed-loop driver,</w:t>
+      </w:r>
+      <w:r>
+        <w:t xml:space="preserve"> </w:t>
+      </w:r>
+      <w:r>
+        <w:t xml:space="preserve">correctly, stays put: no attentive response process can produce these crashes, because</w:t>
+      </w:r>
+      <w:r>
+        <w:t xml:space="preserve"> </w:t>
+      </w:r>
+      <w:r>
+        <w:t xml:space="preserve">there is no conflict to respond to. They are reachable only through the</w:t>
+      </w:r>
+      <w:r>
+        <w:t xml:space="preserve"> </w:t>
+      </w:r>
+      <w:r>
+        <w:t xml:space="preserve">abnormal-acceleration and no-response components, which is how the tier-1 pipeline</w:t>
+      </w:r>
+      <w:r>
+        <w:t xml:space="preserve"> </w:t>
+      </w:r>
+      <w:r>
+        <w:t xml:space="preserve">treats them; in the arbiter comparison they contribute no attentive onsets and are</w:t>
+      </w:r>
+      <w:r>
+        <w:t xml:space="preserve"> </w:t>
+      </w:r>
+      <w:r>
+        <w:t xml:space="preserve">excluded automatically.</w:t>
       </w:r>
     </w:p>
     <w:p>

</xml_diff>